<commit_message>
Iconos y algunas cosas mas
</commit_message>
<xml_diff>
--- a/documentation/Informe_Proyecto_Sistema_Informes_UNU.docx
+++ b/documentation/Informe_Proyecto_Sistema_Informes_UNU.docx
@@ -5966,7 +5966,7 @@
               </w:rPr>
             </w:pPr>
             <w:r>
-              <w:t>Media</w:t>
+              <w:t>Medi</w:t>
             </w:r>
           </w:p>
         </w:tc>
@@ -9523,6 +9523,7 @@
         <w:pStyle w:val="Ttulo3"/>
         <w:jc w:val="both"/>
         <w:rPr>
+          <w:u w:val="single"/>
           <w:lang w:val="es-ES"/>
         </w:rPr>
       </w:pPr>
@@ -9543,6 +9544,30 @@
           <w:lang w:val="es-ES"/>
         </w:rPr>
         <w:t xml:space="preserve">: </w:t>
+      </w:r>
+      <w:r>
+        <w:rPr>
+          <w:lang w:val="es-ES"/>
+        </w:rPr>
+        <w:t>Administración</w:t>
+      </w:r>
+      <w:r>
+        <w:rPr>
+          <w:lang w:val="es-ES"/>
+        </w:rPr>
+        <w:t xml:space="preserve"> de </w:t>
+      </w:r>
+      <w:r>
+        <w:rPr>
+          <w:lang w:val="es-ES"/>
+        </w:rPr>
+        <w:t>r</w:t>
+      </w:r>
+      <w:r>
+        <w:rPr>
+          <w:lang w:val="es-ES"/>
+        </w:rPr>
+        <w:t>eportes</w:t>
       </w:r>
     </w:p>
     <w:p>

</xml_diff>